<commit_message>
ProfitSolv Software Support Rep: refresh resume with Zendesk tickets, permissions, demos; fix Accelo wording
Co-Authored-By: Claude Opus 5.5 <noreply@anthropic.com>
Claude-Session: https://claude.ai/code/session_01Quz1wQsVbycgj85WWSYfNT
</commit_message>
<xml_diff>
--- a/applications/profitsolv-software-support-representative/resume.docx
+++ b/applications/profitsolv-software-support-representative/resume.docx
@@ -178,6 +178,30 @@
           <w:color w:val="1A1A1A"/>
         </w:rPr>
         <w:t>Configure, troubleshoot, and support CRM and automation systems (GoHighLevel, HubSpot, Zapier, Make, n8n) for small-business clients, resolving integration and workflow issues directly.</w:t>
+      </w:r>
+    </w:p>
+    <w:p>
+      <w:pPr>
+        <w:spacing w:after="30"/>
+        <w:ind w:left="259" w:hanging="259"/>
+      </w:pPr>
+      <w:r>
+        <w:rPr>
+          <w:rFonts w:ascii="Calibri" w:hAnsi="Calibri"/>
+          <w:b w:val="0"/>
+          <w:i w:val="0"/>
+          <w:color w:val="163A5F"/>
+        </w:rPr>
+        <w:t xml:space="preserve">•  </w:t>
+      </w:r>
+      <w:r>
+        <w:rPr>
+          <w:rFonts w:ascii="Calibri" w:hAnsi="Calibri"/>
+          <w:b w:val="0"/>
+          <w:i w:val="0"/>
+          <w:color w:val="1A1A1A"/>
+        </w:rPr>
+        <w:t>Set up user roles, access, and permissions in client CRM platforms, and document every configuration change and client interaction.</w:t>
       </w:r>
     </w:p>
     <w:p>
@@ -639,7 +663,7 @@
           <w:i w:val="0"/>
           <w:color w:val="1A1A1A"/>
         </w:rPr>
-        <w:t>Sold and implemented a practice-management (PSA) and CRM platform for agencies and professional-services firms.</w:t>
+        <w:t>Sold and scoped a practice-management (PSA) and CRM platform for agencies and professional-services firms, running live product demos daily.</w:t>
       </w:r>
     </w:p>
     <w:p>
@@ -664,6 +688,30 @@
           <w:color w:val="1A1A1A"/>
         </w:rPr>
         <w:t>Guided client onboarding, workflow design, and API integrations, troubleshooting technical challenges alongside the implementation team and escalating complex issues early.</w:t>
+      </w:r>
+    </w:p>
+    <w:p>
+      <w:pPr>
+        <w:spacing w:after="30"/>
+        <w:ind w:left="259" w:hanging="259"/>
+      </w:pPr>
+      <w:r>
+        <w:rPr>
+          <w:rFonts w:ascii="Calibri" w:hAnsi="Calibri"/>
+          <w:b w:val="0"/>
+          <w:i w:val="0"/>
+          <w:color w:val="163A5F"/>
+        </w:rPr>
+        <w:t xml:space="preserve">•  </w:t>
+      </w:r>
+      <w:r>
+        <w:rPr>
+          <w:rFonts w:ascii="Calibri" w:hAnsi="Calibri"/>
+          <w:b w:val="0"/>
+          <w:i w:val="0"/>
+          <w:color w:val="1A1A1A"/>
+        </w:rPr>
+        <w:t>Tracked and worked customer issues through Zendesk tickets, coordinating resolution with the implementation team.</w:t>
       </w:r>
     </w:p>
     <w:p>
@@ -729,7 +777,7 @@
           <w:i w:val="0"/>
           <w:color w:val="1A1A1A"/>
         </w:rPr>
-        <w:t>Phone &amp; Email Client Support, Troubleshooting &amp; Escalation, Case Documentation, Knowledge Base &amp; Training Content, Upsell &amp; Cross-Sell Identification</w:t>
+        <w:t>Phone &amp; Email Client Support, Troubleshooting &amp; Escalation, Case Documentation, User Access &amp; Permissions, Training Content &amp; Product Guides, Upsell &amp; Cross-Sell Identification</w:t>
       </w:r>
     </w:p>
     <w:p>

</xml_diff>

<commit_message>
ProfitSolv: tighten refreshed resume to one page
Co-Authored-By: Claude Opus 5.5 <noreply@anthropic.com>
Claude-Session: https://claude.ai/code/session_01Quz1wQsVbycgj85WWSYfNT
</commit_message>
<xml_diff>
--- a/applications/profitsolv-software-support-representative/resume.docx
+++ b/applications/profitsolv-software-support-representative/resume.docx
@@ -80,7 +80,7 @@
           <w:i w:val="0"/>
           <w:color w:val="1A1A1A"/>
         </w:rPr>
-        <w:t>Client-facing SaaS professional with 15+ years guiding customers through software setup, troubleshooting, and adoption by phone, email, and screen share. Sold and implemented Accelo's practice-management (PSA) and CRM platform for professional-services firms, walked 25+ Wix clients a month through launch, and resolved complex configuration issues for Birdeye partners. Explains technical problems in plain terms, documents every interaction, and spots the patterns worth sending to Product.</w:t>
+        <w:t>Client-facing SaaS professional with 15+ years guiding customers through software setup, troubleshooting, and adoption by phone, email, and screen share. Sold and scoped Accelo's practice-management (PSA) and CRM platform, walked 25+ Wix clients a month through launch, and resolved complex configuration issues for Birdeye partners. Documents every interaction and sends the patterns worth fixing to Product.</w:t>
       </w:r>
     </w:p>
     <w:p>
@@ -177,31 +177,7 @@
           <w:i w:val="0"/>
           <w:color w:val="1A1A1A"/>
         </w:rPr>
-        <w:t>Configure, troubleshoot, and support CRM and automation systems (GoHighLevel, HubSpot, Zapier, Make, n8n) for small-business clients, resolving integration and workflow issues directly.</w:t>
-      </w:r>
-    </w:p>
-    <w:p>
-      <w:pPr>
-        <w:spacing w:after="30"/>
-        <w:ind w:left="259" w:hanging="259"/>
-      </w:pPr>
-      <w:r>
-        <w:rPr>
-          <w:rFonts w:ascii="Calibri" w:hAnsi="Calibri"/>
-          <w:b w:val="0"/>
-          <w:i w:val="0"/>
-          <w:color w:val="163A5F"/>
-        </w:rPr>
-        <w:t xml:space="preserve">•  </w:t>
-      </w:r>
-      <w:r>
-        <w:rPr>
-          <w:rFonts w:ascii="Calibri" w:hAnsi="Calibri"/>
-          <w:b w:val="0"/>
-          <w:i w:val="0"/>
-          <w:color w:val="1A1A1A"/>
-        </w:rPr>
-        <w:t>Set up user roles, access, and permissions in client CRM platforms, and document every configuration change and client interaction.</w:t>
+        <w:t>Configure, troubleshoot, and support CRM and automation systems (GoHighLevel, HubSpot, Zapier, Make, n8n) for small-business clients, including user roles and permissions, resolving integration and workflow issues directly.</w:t>
       </w:r>
     </w:p>
     <w:p>
@@ -566,30 +542,6 @@
     </w:p>
     <w:p>
       <w:pPr>
-        <w:spacing w:after="30"/>
-        <w:ind w:left="259" w:hanging="259"/>
-      </w:pPr>
-      <w:r>
-        <w:rPr>
-          <w:rFonts w:ascii="Calibri" w:hAnsi="Calibri"/>
-          <w:b w:val="0"/>
-          <w:i w:val="0"/>
-          <w:color w:val="163A5F"/>
-        </w:rPr>
-        <w:t xml:space="preserve">•  </w:t>
-      </w:r>
-      <w:r>
-        <w:rPr>
-          <w:rFonts w:ascii="Calibri" w:hAnsi="Calibri"/>
-          <w:b w:val="0"/>
-          <w:i w:val="0"/>
-          <w:color w:val="1A1A1A"/>
-        </w:rPr>
-        <w:t>Guided clients through technical setup including Google Tag Manager and Google Business Profile connections.</w:t>
-      </w:r>
-    </w:p>
-    <w:p>
-      <w:pPr>
         <w:tabs>
           <w:tab w:pos="10512" w:val="right"/>
         </w:tabs>
@@ -712,30 +664,6 @@
           <w:color w:val="1A1A1A"/>
         </w:rPr>
         <w:t>Tracked and worked customer issues through Zendesk tickets, coordinating resolution with the implementation team.</w:t>
-      </w:r>
-    </w:p>
-    <w:p>
-      <w:pPr>
-        <w:spacing w:after="30"/>
-        <w:ind w:left="259" w:hanging="259"/>
-      </w:pPr>
-      <w:r>
-        <w:rPr>
-          <w:rFonts w:ascii="Calibri" w:hAnsi="Calibri"/>
-          <w:b w:val="0"/>
-          <w:i w:val="0"/>
-          <w:color w:val="163A5F"/>
-        </w:rPr>
-        <w:t xml:space="preserve">•  </w:t>
-      </w:r>
-      <w:r>
-        <w:rPr>
-          <w:rFonts w:ascii="Calibri" w:hAnsi="Calibri"/>
-          <w:b w:val="0"/>
-          <w:i w:val="0"/>
-          <w:color w:val="1A1A1A"/>
-        </w:rPr>
-        <w:t>Built Zapier automations connecting the platform to clients' other tools.</w:t>
       </w:r>
     </w:p>
     <w:p>

</xml_diff>